<commit_message>
fix: casos-existentes.md reestruturado + docx regenerado
</commit_message>
<xml_diff>
--- a/disciplinas/gcetens843-projeto-algoritmo-i/atividades/trabalhos/projeto-algoritmos/casos-existentes.docx
+++ b/disciplinas/gcetens843-projeto-algoritmo-i/atividades/trabalhos/projeto-algoritmos/casos-existentes.docx
@@ -2,7 +2,7 @@
 <file path=word/document.xml><?xml version="1.0" encoding="utf-8"?>
 <w:document xmlns:w="http://schemas.openxmlformats.org/wordprocessingml/2006/main" xmlns:m="http://schemas.openxmlformats.org/officeDocument/2006/math" xmlns:r="http://schemas.openxmlformats.org/officeDocument/2006/relationships" xmlns:o="urn:schemas-microsoft-com:office:office" xmlns:v="urn:schemas-microsoft-com:vml" xmlns:w10="urn:schemas-microsoft-com:office:word" xmlns:a="http://schemas.openxmlformats.org/drawingml/2006/main" xmlns:pic="http://schemas.openxmlformats.org/drawingml/2006/picture" xmlns:wp="http://schemas.openxmlformats.org/drawingml/2006/wordprocessingDrawing">
   <w:body>
-    <w:bookmarkStart w:id="27" w:name="casos-existentes-minhafila"/>
+    <w:bookmarkStart w:id="32" w:name="casos-existentes-minhafila"/>
     <w:p>
       <w:pPr>
         <w:pStyle w:val="Heading1"/>
@@ -26,7 +26,7 @@
         <w:t xml:space="preserve"> </w:t>
       </w:r>
       <w:r>
-        <w:t xml:space="preserve">Ausiane + Núbia</w:t>
+        <w:t xml:space="preserve">Ausiane de Oliveira Costa + Núbia Rosália de Souza Ramos</w:t>
       </w:r>
       <w:r>
         <w:br/>
@@ -36,45 +36,78 @@
           <w:b/>
           <w:bCs/>
         </w:rPr>
-        <w:t xml:space="preserve">Fontes principais:</w:t>
-      </w:r>
-      <w:r>
-        <w:t xml:space="preserve"> </w:t>
-      </w:r>
-      <w:r>
-        <w:t xml:space="preserve">Google Docs (atualizado em tempo real)</w:t>
-      </w:r>
-      <w:r>
-        <w:br/>
+        <w:t xml:space="preserve">Última atualização:</w:t>
+      </w:r>
+      <w:r>
+        <w:t xml:space="preserve"> </w:t>
+      </w:r>
+      <w:r>
+        <w:t xml:space="preserve">28/06/2026</w:t>
+      </w:r>
+    </w:p>
+    <w:p>
+      <w:r>
+        <w:pict>
+          <v:rect style="width:0;height:1.5pt" o:hralign="center" o:hrstd="t" o:hr="t"/>
+        </w:pict>
+      </w:r>
+    </w:p>
+    <w:bookmarkStart w:id="25" w:name="sistemas-de-gerenciamento-de-filas-qms"/>
+    <w:p>
+      <w:pPr>
+        <w:pStyle w:val="Heading2"/>
+      </w:pPr>
+      <w:r>
+        <w:t xml:space="preserve">1. Sistemas de Gerenciamento de Filas (QMS)</w:t>
+      </w:r>
+    </w:p>
+    <w:bookmarkStart w:id="20" w:name="qmatic"/>
+    <w:p>
+      <w:pPr>
+        <w:pStyle w:val="Heading3"/>
+      </w:pPr>
+      <w:r>
+        <w:t xml:space="preserve">1.1 Qmatic</w:t>
+      </w:r>
+    </w:p>
+    <w:p>
+      <w:pPr>
+        <w:pStyle w:val="FirstParagraph"/>
+      </w:pPr>
+      <w:r>
+        <w:t xml:space="preserve">Plataforma global de gerenciamento de filas com totens de autoatendimento, painéis de chamada e analytics. Atua em bancos, saúde, governo e varejo.</w:t>
+      </w:r>
+      <w:r>
+        <w:t xml:space="preserve"> </w:t>
+      </w:r>
+      <w:r>
+        <w:t xml:space="preserve">-</w:t>
+      </w:r>
+      <w:r>
+        <w:t xml:space="preserve"> </w:t>
       </w:r>
       <w:r>
         <w:rPr>
           <w:b/>
           <w:bCs/>
         </w:rPr>
-        <w:t xml:space="preserve">Última sincronização do repositório:</w:t>
-      </w:r>
-      <w:r>
-        <w:t xml:space="preserve"> </w:t>
-      </w:r>
-      <w:r>
-        <w:t xml:space="preserve">26/06/2026</w:t>
-      </w:r>
-    </w:p>
-    <w:p>
-      <w:r>
-        <w:pict>
-          <v:rect style="width:0;height:1.5pt" o:hralign="center" o:hrstd="t" o:hr="t"/>
-        </w:pict>
-      </w:r>
-    </w:p>
-    <w:bookmarkStart w:id="20" w:name="documento-de-trabalho-ativo"/>
-    <w:p>
-      <w:pPr>
-        <w:pStyle w:val="Heading2"/>
-      </w:pPr>
-      <w:r>
-        <w:t xml:space="preserve">⚠️ Documento de trabalho ativo</w:t>
+        <w:t xml:space="preserve">Site:</w:t>
+      </w:r>
+      <w:r>
+        <w:t xml:space="preserve"> </w:t>
+      </w:r>
+      <w:r>
+        <w:t xml:space="preserve">https://www.qmatic.com</w:t>
+      </w:r>
+    </w:p>
+    <w:bookmarkEnd w:id="20"/>
+    <w:bookmarkStart w:id="21" w:name="wavetec"/>
+    <w:p>
+      <w:pPr>
+        <w:pStyle w:val="Heading3"/>
+      </w:pPr>
+      <w:r>
+        <w:t xml:space="preserve">1.2 Wavetec</w:t>
       </w:r>
     </w:p>
     <w:p>
@@ -82,25 +115,149 @@
         <w:pStyle w:val="FirstParagraph"/>
       </w:pPr>
       <w:r>
-        <w:t xml:space="preserve">A pesquisa de casos está sendo construída principalmente neste Google Doc:</w:t>
-      </w:r>
-    </w:p>
-    <w:p>
-      <w:pPr>
-        <w:pStyle w:val="BodyText"/>
-      </w:pPr>
+        <w:t xml:space="preserve">Sistema de filas com painéis eletrônicos, agendamento online e módulo de acessibilidade. Setores: saúde, educação, governo.</w:t>
+      </w:r>
+      <w:r>
+        <w:t xml:space="preserve"> </w:t>
+      </w:r>
+      <w:r>
+        <w:t xml:space="preserve">-</w:t>
+      </w:r>
+      <w:r>
+        <w:t xml:space="preserve"> </w:t>
+      </w:r>
       <w:r>
         <w:rPr>
           <w:b/>
           <w:bCs/>
         </w:rPr>
-        <w:t xml:space="preserve">Casos existentes:</w:t>
-      </w:r>
-      <w:r>
-        <w:br/>
-      </w:r>
-      <w:r>
-        <w:t xml:space="preserve">https://docs.google.com/document/d/1mSFvxPnuMh5f13xKnHx1B3A1n4uhkBJokg0afE9Tdgw/edit?usp=sharing</w:t>
+        <w:t xml:space="preserve">Site:</w:t>
+      </w:r>
+      <w:r>
+        <w:t xml:space="preserve"> </w:t>
+      </w:r>
+      <w:r>
+        <w:t xml:space="preserve">https://www.wavetec.com</w:t>
+      </w:r>
+    </w:p>
+    <w:bookmarkEnd w:id="21"/>
+    <w:bookmarkStart w:id="22" w:name="waitwhile"/>
+    <w:p>
+      <w:pPr>
+        <w:pStyle w:val="Heading3"/>
+      </w:pPr>
+      <w:r>
+        <w:t xml:space="preserve">1.3 Waitwhile</w:t>
+      </w:r>
+    </w:p>
+    <w:p>
+      <w:pPr>
+        <w:pStyle w:val="FirstParagraph"/>
+      </w:pPr>
+      <w:r>
+        <w:t xml:space="preserve">Plataforma de gestão de filas com check-in remoto, notificações SMS e métricas de espera. Varejo, saúde, serviços.</w:t>
+      </w:r>
+      <w:r>
+        <w:t xml:space="preserve"> </w:t>
+      </w:r>
+      <w:r>
+        <w:t xml:space="preserve">-</w:t>
+      </w:r>
+      <w:r>
+        <w:t xml:space="preserve"> </w:t>
+      </w:r>
+      <w:r>
+        <w:rPr>
+          <w:b/>
+          <w:bCs/>
+        </w:rPr>
+        <w:t xml:space="preserve">Site:</w:t>
+      </w:r>
+      <w:r>
+        <w:t xml:space="preserve"> </w:t>
+      </w:r>
+      <w:r>
+        <w:t xml:space="preserve">https://waitwhile.com</w:t>
+      </w:r>
+    </w:p>
+    <w:bookmarkEnd w:id="22"/>
+    <w:bookmarkStart w:id="23" w:name="senha-fácil"/>
+    <w:p>
+      <w:pPr>
+        <w:pStyle w:val="Heading3"/>
+      </w:pPr>
+      <w:r>
+        <w:t xml:space="preserve">1.4 Senha Fácil</w:t>
+      </w:r>
+    </w:p>
+    <w:p>
+      <w:pPr>
+        <w:pStyle w:val="FirstParagraph"/>
+      </w:pPr>
+      <w:r>
+        <w:t xml:space="preserve">Sistema brasileiro de distribuição eletrônica de senhas com painéis e relatórios. Bancos, clínicas, comércio.</w:t>
+      </w:r>
+      <w:r>
+        <w:t xml:space="preserve"> </w:t>
+      </w:r>
+      <w:r>
+        <w:t xml:space="preserve">-</w:t>
+      </w:r>
+      <w:r>
+        <w:t xml:space="preserve"> </w:t>
+      </w:r>
+      <w:r>
+        <w:rPr>
+          <w:b/>
+          <w:bCs/>
+        </w:rPr>
+        <w:t xml:space="preserve">Site:</w:t>
+      </w:r>
+      <w:r>
+        <w:t xml:space="preserve"> </w:t>
+      </w:r>
+      <w:r>
+        <w:t xml:space="preserve">https://www.senhafacil.com.br</w:t>
+      </w:r>
+    </w:p>
+    <w:bookmarkEnd w:id="23"/>
+    <w:bookmarkStart w:id="24" w:name="totvs-gestão-de-filas"/>
+    <w:p>
+      <w:pPr>
+        <w:pStyle w:val="Heading3"/>
+      </w:pPr>
+      <w:r>
+        <w:t xml:space="preserve">1.5 TOTVS Gestão de Filas</w:t>
+      </w:r>
+    </w:p>
+    <w:p>
+      <w:pPr>
+        <w:pStyle w:val="FirstParagraph"/>
+      </w:pPr>
+      <w:r>
+        <w:t xml:space="preserve">Solução integrada ao ecossistema TOTVS para controle de atendimento presencial. Varejo, saúde, serviços.</w:t>
+      </w:r>
+      <w:r>
+        <w:t xml:space="preserve"> </w:t>
+      </w:r>
+      <w:r>
+        <w:t xml:space="preserve">-</w:t>
+      </w:r>
+      <w:r>
+        <w:t xml:space="preserve"> </w:t>
+      </w:r>
+      <w:r>
+        <w:rPr>
+          <w:b/>
+          <w:bCs/>
+        </w:rPr>
+        <w:t xml:space="preserve">Site:</w:t>
+      </w:r>
+      <w:r>
+        <w:t xml:space="preserve"> </w:t>
+      </w:r>
+      <w:r>
+        <w:t xml:space="preserve">https://www.totvs.com</w:t>
       </w:r>
     </w:p>
     <w:p>
@@ -110,522 +267,136 @@
         </w:pict>
       </w:r>
     </w:p>
-    <w:bookmarkEnd w:id="20"/>
-    <w:bookmarkStart w:id="23" w:name="soluções-de-mercado-e-referências"/>
+    <w:bookmarkEnd w:id="24"/>
+    <w:bookmarkEnd w:id="25"/>
+    <w:bookmarkStart w:id="29" w:name="iniciativas-governamentais"/>
     <w:p>
       <w:pPr>
         <w:pStyle w:val="Heading2"/>
       </w:pPr>
       <w:r>
-        <w:t xml:space="preserve">Soluções de Mercado e Referências</w:t>
-      </w:r>
-    </w:p>
-    <w:bookmarkStart w:id="21" w:name="sistemas-de-gerenciamento-de-filas-qms"/>
+        <w:t xml:space="preserve">2. Iniciativas Governamentais</w:t>
+      </w:r>
+    </w:p>
+    <w:bookmarkStart w:id="26" w:name="ia-monitora-filas-em-foz-do-iguaçu"/>
     <w:p>
       <w:pPr>
         <w:pStyle w:val="Heading3"/>
       </w:pPr>
       <w:r>
-        <w:t xml:space="preserve">Sistemas de Gerenciamento de Filas (QMS)</w:t>
-      </w:r>
-    </w:p>
-    <w:tbl>
-      <w:tblPr>
-        <w:tblStyle w:val="Table"/>
-        <w:tblW w:type="pct" w:w="5000"/>
-        <w:tblLayout w:type="fixed"/>
-        <w:tblLook w:firstRow="1" w:lastRow="0" w:firstColumn="0" w:lastColumn="0" w:noHBand="0" w:noVBand="0" w:val="0020"/>
-      </w:tblPr>
-      <w:tblGrid>
-        <w:gridCol w:w="1584"/>
-        <w:gridCol w:w="2904"/>
-        <w:gridCol w:w="1848"/>
-        <w:gridCol w:w="1584"/>
-      </w:tblGrid>
-      <w:tr>
-        <w:trPr>
-          <w:tblHeader w:val="on"/>
-        </w:trPr>
-        <w:tc>
-          <w:tcPr/>
-          <w:p>
-            <w:pPr>
-              <w:pStyle w:val="Compact"/>
-            </w:pPr>
-            <w:r>
-              <w:t xml:space="preserve">Caso</w:t>
-            </w:r>
-          </w:p>
-        </w:tc>
-        <w:tc>
-          <w:tcPr/>
-          <w:p>
-            <w:pPr>
-              <w:pStyle w:val="Compact"/>
-            </w:pPr>
-            <w:r>
-              <w:t xml:space="preserve">Descrição</w:t>
-            </w:r>
-          </w:p>
-        </w:tc>
-        <w:tc>
-          <w:tcPr/>
-          <w:p>
-            <w:pPr>
-              <w:pStyle w:val="Compact"/>
-            </w:pPr>
-            <w:r>
-              <w:t xml:space="preserve">Setor</w:t>
-            </w:r>
-          </w:p>
-        </w:tc>
-        <w:tc>
-          <w:tcPr/>
-          <w:p>
-            <w:pPr>
-              <w:pStyle w:val="Compact"/>
-            </w:pPr>
-            <w:r>
-              <w:t xml:space="preserve">Link</w:t>
-            </w:r>
-          </w:p>
-        </w:tc>
-      </w:tr>
-      <w:tr>
-        <w:tc>
-          <w:tcPr/>
-          <w:p>
-            <w:pPr>
-              <w:pStyle w:val="Compact"/>
-            </w:pPr>
-            <w:r>
-              <w:rPr>
-                <w:b/>
-                <w:bCs/>
-              </w:rPr>
-              <w:t xml:space="preserve">Qmatic</w:t>
-            </w:r>
-          </w:p>
-        </w:tc>
-        <w:tc>
-          <w:tcPr/>
-          <w:p>
-            <w:pPr>
-              <w:pStyle w:val="Compact"/>
-            </w:pPr>
-            <w:r>
-              <w:t xml:space="preserve">Plataforma global de gerenciamento de filas com totens de autoatendimento, painéis de chamada e analytics.</w:t>
-            </w:r>
-          </w:p>
-        </w:tc>
-        <w:tc>
-          <w:tcPr/>
-          <w:p>
-            <w:pPr>
-              <w:pStyle w:val="Compact"/>
-            </w:pPr>
-            <w:r>
-              <w:t xml:space="preserve">Multissetorial (bancos, saúde, governo, varejo)</w:t>
-            </w:r>
-          </w:p>
-        </w:tc>
-        <w:tc>
-          <w:tcPr/>
-          <w:p>
-            <w:pPr>
-              <w:pStyle w:val="Compact"/>
-            </w:pPr>
-            <w:r>
-              <w:t xml:space="preserve">https://www.qmatic.com</w:t>
-            </w:r>
-          </w:p>
-        </w:tc>
-      </w:tr>
-      <w:tr>
-        <w:tc>
-          <w:tcPr/>
-          <w:p>
-            <w:pPr>
-              <w:pStyle w:val="Compact"/>
-            </w:pPr>
-            <w:r>
-              <w:rPr>
-                <w:b/>
-                <w:bCs/>
-              </w:rPr>
-              <w:t xml:space="preserve">Wavetec</w:t>
-            </w:r>
-          </w:p>
-        </w:tc>
-        <w:tc>
-          <w:tcPr/>
-          <w:p>
-            <w:pPr>
-              <w:pStyle w:val="Compact"/>
-            </w:pPr>
-            <w:r>
-              <w:t xml:space="preserve">Sistema de filas com painéis eletrônicos, agendamento online e módulo de acessibilidade.</w:t>
-            </w:r>
-          </w:p>
-        </w:tc>
-        <w:tc>
-          <w:tcPr/>
-          <w:p>
-            <w:pPr>
-              <w:pStyle w:val="Compact"/>
-            </w:pPr>
-            <w:r>
-              <w:t xml:space="preserve">Multissetorial (saúde, educação, governo)</w:t>
-            </w:r>
-          </w:p>
-        </w:tc>
-        <w:tc>
-          <w:tcPr/>
-          <w:p>
-            <w:pPr>
-              <w:pStyle w:val="Compact"/>
-            </w:pPr>
-            <w:r>
-              <w:t xml:space="preserve">https://www.wavetec.com</w:t>
-            </w:r>
-          </w:p>
-        </w:tc>
-      </w:tr>
-      <w:tr>
-        <w:tc>
-          <w:tcPr/>
-          <w:p>
-            <w:pPr>
-              <w:pStyle w:val="Compact"/>
-            </w:pPr>
-            <w:r>
-              <w:rPr>
-                <w:b/>
-                <w:bCs/>
-              </w:rPr>
-              <w:t xml:space="preserve">Waitwhile</w:t>
-            </w:r>
-          </w:p>
-        </w:tc>
-        <w:tc>
-          <w:tcPr/>
-          <w:p>
-            <w:pPr>
-              <w:pStyle w:val="Compact"/>
-            </w:pPr>
-            <w:r>
-              <w:t xml:space="preserve">Plataforma de gestão de filas com check-in remoto, notificações SMS e métricas de espera.</w:t>
-            </w:r>
-          </w:p>
-        </w:tc>
-        <w:tc>
-          <w:tcPr/>
-          <w:p>
-            <w:pPr>
-              <w:pStyle w:val="Compact"/>
-            </w:pPr>
-            <w:r>
-              <w:t xml:space="preserve">Varejo, saúde, serviços</w:t>
-            </w:r>
-          </w:p>
-        </w:tc>
-        <w:tc>
-          <w:tcPr/>
-          <w:p>
-            <w:pPr>
-              <w:pStyle w:val="Compact"/>
-            </w:pPr>
-            <w:r>
-              <w:t xml:space="preserve">https://waitwhile.com</w:t>
-            </w:r>
-          </w:p>
-        </w:tc>
-      </w:tr>
-      <w:tr>
-        <w:tc>
-          <w:tcPr/>
-          <w:p>
-            <w:pPr>
-              <w:pStyle w:val="Compact"/>
-            </w:pPr>
-            <w:r>
-              <w:rPr>
-                <w:b/>
-                <w:bCs/>
-              </w:rPr>
-              <w:t xml:space="preserve">Senha Fácil</w:t>
-            </w:r>
-          </w:p>
-        </w:tc>
-        <w:tc>
-          <w:tcPr/>
-          <w:p>
-            <w:pPr>
-              <w:pStyle w:val="Compact"/>
-            </w:pPr>
-            <w:r>
-              <w:t xml:space="preserve">Sistema brasileiro de distribuição eletrônica de senhas com painéis e relatórios.</w:t>
-            </w:r>
-          </w:p>
-        </w:tc>
-        <w:tc>
-          <w:tcPr/>
-          <w:p>
-            <w:pPr>
-              <w:pStyle w:val="Compact"/>
-            </w:pPr>
-            <w:r>
-              <w:t xml:space="preserve">Bancos, clínicas, comércio</w:t>
-            </w:r>
-          </w:p>
-        </w:tc>
-        <w:tc>
-          <w:tcPr/>
-          <w:p>
-            <w:pPr>
-              <w:pStyle w:val="Compact"/>
-            </w:pPr>
-            <w:r>
-              <w:t xml:space="preserve">https://www.senhafacil.com.br</w:t>
-            </w:r>
-          </w:p>
-        </w:tc>
-      </w:tr>
-      <w:tr>
-        <w:tc>
-          <w:tcPr/>
-          <w:p>
-            <w:pPr>
-              <w:pStyle w:val="Compact"/>
-            </w:pPr>
-            <w:r>
-              <w:rPr>
-                <w:b/>
-                <w:bCs/>
-              </w:rPr>
-              <w:t xml:space="preserve">TOTVS Gestão de Filas</w:t>
-            </w:r>
-          </w:p>
-        </w:tc>
-        <w:tc>
-          <w:tcPr/>
-          <w:p>
-            <w:pPr>
-              <w:pStyle w:val="Compact"/>
-            </w:pPr>
-            <w:r>
-              <w:t xml:space="preserve">Solução integrada ao ecossistema TOTVS para controle de atendimento presencial.</w:t>
-            </w:r>
-          </w:p>
-        </w:tc>
-        <w:tc>
-          <w:tcPr/>
-          <w:p>
-            <w:pPr>
-              <w:pStyle w:val="Compact"/>
-            </w:pPr>
-            <w:r>
-              <w:t xml:space="preserve">Varejo, saúde, serviços</w:t>
-            </w:r>
-          </w:p>
-        </w:tc>
-        <w:tc>
-          <w:tcPr/>
-          <w:p>
-            <w:pPr>
-              <w:pStyle w:val="Compact"/>
-            </w:pPr>
-            <w:r>
-              <w:t xml:space="preserve">https://www.totvs.com</w:t>
-            </w:r>
-          </w:p>
-        </w:tc>
-      </w:tr>
-    </w:tbl>
-    <w:bookmarkEnd w:id="21"/>
-    <w:bookmarkStart w:id="22" w:name="iniciativas-governamentais"/>
+        <w:t xml:space="preserve">2.1 IA monitora filas em Foz do Iguaçu</w:t>
+      </w:r>
+    </w:p>
+    <w:p>
+      <w:pPr>
+        <w:pStyle w:val="FirstParagraph"/>
+      </w:pPr>
+      <w:r>
+        <w:t xml:space="preserve">Sistema de IA autônoma que monitora filas de consultas e serviços públicos com busca ativa automática.</w:t>
+      </w:r>
+      <w:r>
+        <w:t xml:space="preserve"> </w:t>
+      </w:r>
+      <w:r>
+        <w:t xml:space="preserve">-</w:t>
+      </w:r>
+      <w:r>
+        <w:t xml:space="preserve"> </w:t>
+      </w:r>
+      <w:r>
+        <w:rPr>
+          <w:b/>
+          <w:bCs/>
+        </w:rPr>
+        <w:t xml:space="preserve">Fonte:</w:t>
+      </w:r>
+      <w:r>
+        <w:t xml:space="preserve"> </w:t>
+      </w:r>
+      <w:r>
+        <w:t xml:space="preserve">https://www.foz.pr.gov.br/ia-passa-a-monitorar-filas-da-saude-primeira-infancia-e-atuacao-em-campo-de-agentes-comunitarios-de-saude/</w:t>
+      </w:r>
+    </w:p>
+    <w:bookmarkEnd w:id="26"/>
+    <w:bookmarkStart w:id="27" w:name="agir-atendimento-via-whatsapp-goiás"/>
     <w:p>
       <w:pPr>
         <w:pStyle w:val="Heading3"/>
       </w:pPr>
       <w:r>
-        <w:t xml:space="preserve">Iniciativas Governamentais</w:t>
-      </w:r>
-    </w:p>
-    <w:tbl>
-      <w:tblPr>
-        <w:tblStyle w:val="Table"/>
-        <w:tblW w:type="pct" w:w="5000"/>
-        <w:tblLayout w:type="fixed"/>
-        <w:tblLook w:firstRow="1" w:lastRow="0" w:firstColumn="0" w:lastColumn="0" w:noHBand="0" w:noVBand="0" w:val="0020"/>
-      </w:tblPr>
-      <w:tblGrid>
-        <w:gridCol w:w="2066"/>
-        <w:gridCol w:w="3787"/>
-        <w:gridCol w:w="2066"/>
-      </w:tblGrid>
-      <w:tr>
-        <w:trPr>
-          <w:tblHeader w:val="on"/>
-        </w:trPr>
-        <w:tc>
-          <w:tcPr/>
-          <w:p>
-            <w:pPr>
-              <w:pStyle w:val="Compact"/>
-            </w:pPr>
-            <w:r>
-              <w:t xml:space="preserve">Caso</w:t>
-            </w:r>
-          </w:p>
-        </w:tc>
-        <w:tc>
-          <w:tcPr/>
-          <w:p>
-            <w:pPr>
-              <w:pStyle w:val="Compact"/>
-            </w:pPr>
-            <w:r>
-              <w:t xml:space="preserve">Descrição</w:t>
-            </w:r>
-          </w:p>
-        </w:tc>
-        <w:tc>
-          <w:tcPr/>
-          <w:p>
-            <w:pPr>
-              <w:pStyle w:val="Compact"/>
-            </w:pPr>
-            <w:r>
-              <w:t xml:space="preserve">Link</w:t>
-            </w:r>
-          </w:p>
-        </w:tc>
-      </w:tr>
-      <w:tr>
-        <w:tc>
-          <w:tcPr/>
-          <w:p>
-            <w:pPr>
-              <w:pStyle w:val="Compact"/>
-            </w:pPr>
-            <w:r>
-              <w:rPr>
-                <w:b/>
-                <w:bCs/>
-              </w:rPr>
-              <w:t xml:space="preserve">IA monitora filas em Foz do Iguaçu</w:t>
-            </w:r>
-          </w:p>
-        </w:tc>
-        <w:tc>
-          <w:tcPr/>
-          <w:p>
-            <w:pPr>
-              <w:pStyle w:val="Compact"/>
-            </w:pPr>
-            <w:r>
-              <w:t xml:space="preserve">Sistema de IA autônoma que monitora filas de consultas e serviços públicos com busca ativa automática.</w:t>
-            </w:r>
-          </w:p>
-        </w:tc>
-        <w:tc>
-          <w:tcPr/>
-          <w:p>
-            <w:pPr>
-              <w:pStyle w:val="Compact"/>
-            </w:pPr>
-            <w:r>
-              <w:t xml:space="preserve">https://www.foz.pr.gov.br/ia-passa-a-monitorar-filas-da-saude-primeira-infancia-e-atuacao-em-campo-de-agentes-comunitarios-de-saude/</w:t>
-            </w:r>
-          </w:p>
-        </w:tc>
-      </w:tr>
-      <w:tr>
-        <w:tc>
-          <w:tcPr/>
-          <w:p>
-            <w:pPr>
-              <w:pStyle w:val="Compact"/>
-            </w:pPr>
-            <w:r>
-              <w:rPr>
-                <w:b/>
-                <w:bCs/>
-              </w:rPr>
-              <w:t xml:space="preserve">Agir – Atendimento via WhatsApp</w:t>
-            </w:r>
-            <w:r>
-              <w:t xml:space="preserve"> </w:t>
-            </w:r>
-            <w:r>
-              <w:t xml:space="preserve">(Goiás)</w:t>
-            </w:r>
-          </w:p>
-        </w:tc>
-        <w:tc>
-          <w:tcPr/>
-          <w:p>
-            <w:pPr>
-              <w:pStyle w:val="Compact"/>
-            </w:pPr>
-            <w:r>
-              <w:t xml:space="preserve">Transformação digital com atendimento por WhatsApp em unidades de saúde.</w:t>
-            </w:r>
-          </w:p>
-        </w:tc>
-        <w:tc>
-          <w:tcPr/>
-          <w:p>
-            <w:pPr>
-              <w:pStyle w:val="Compact"/>
-            </w:pPr>
-            <w:r>
-              <w:t xml:space="preserve">https://www.agirsaude.org.br/noticia/view/4548/agir-acelera-transformacao-digital-na-saude-publica-com-atendimento-via-whatsapp-em-hospitais-de-goias</w:t>
-            </w:r>
-          </w:p>
-        </w:tc>
-      </w:tr>
-      <w:tr>
-        <w:tc>
-          <w:tcPr/>
-          <w:p>
-            <w:pPr>
-              <w:pStyle w:val="Compact"/>
-            </w:pPr>
-            <w:r>
-              <w:rPr>
-                <w:b/>
-                <w:bCs/>
-              </w:rPr>
-              <w:t xml:space="preserve">Meu SUS Digital</w:t>
-            </w:r>
-          </w:p>
-        </w:tc>
-        <w:tc>
-          <w:tcPr/>
-          <w:p>
-            <w:pPr>
-              <w:pStyle w:val="Compact"/>
-            </w:pPr>
-            <w:r>
-              <w:t xml:space="preserve">Plataforma do Ministério da Saúde para acesso a serviços e informações digitais.</w:t>
-            </w:r>
-          </w:p>
-        </w:tc>
-        <w:tc>
-          <w:tcPr/>
-          <w:p>
-            <w:pPr>
-              <w:pStyle w:val="Compact"/>
-            </w:pPr>
-            <w:r>
-              <w:t xml:space="preserve">https://www.gov.br/saude/pt-br/composicao/seidigi/meususdigital</w:t>
-            </w:r>
-          </w:p>
-        </w:tc>
-      </w:tr>
-    </w:tbl>
+        <w:t xml:space="preserve">2.2 Agir – Atendimento via WhatsApp (Goiás)</w:t>
+      </w:r>
+    </w:p>
+    <w:p>
+      <w:pPr>
+        <w:pStyle w:val="FirstParagraph"/>
+      </w:pPr>
+      <w:r>
+        <w:t xml:space="preserve">Transformação digital com atendimento por WhatsApp em unidades de saúde.</w:t>
+      </w:r>
+      <w:r>
+        <w:t xml:space="preserve"> </w:t>
+      </w:r>
+      <w:r>
+        <w:t xml:space="preserve">-</w:t>
+      </w:r>
+      <w:r>
+        <w:t xml:space="preserve"> </w:t>
+      </w:r>
+      <w:r>
+        <w:rPr>
+          <w:b/>
+          <w:bCs/>
+        </w:rPr>
+        <w:t xml:space="preserve">Fonte:</w:t>
+      </w:r>
+      <w:r>
+        <w:t xml:space="preserve"> </w:t>
+      </w:r>
+      <w:r>
+        <w:t xml:space="preserve">https://www.agirsaude.org.br/noticia/view/4548/agir-acelera-transformacao-digital-na-saude-publica-com-atendimento-via-whatsapp-em-hospitais-de-goias</w:t>
+      </w:r>
+    </w:p>
+    <w:bookmarkEnd w:id="27"/>
+    <w:bookmarkStart w:id="28" w:name="meu-sus-digital"/>
+    <w:p>
+      <w:pPr>
+        <w:pStyle w:val="Heading3"/>
+      </w:pPr>
+      <w:r>
+        <w:t xml:space="preserve">2.3 Meu SUS Digital</w:t>
+      </w:r>
+    </w:p>
+    <w:p>
+      <w:pPr>
+        <w:pStyle w:val="FirstParagraph"/>
+      </w:pPr>
+      <w:r>
+        <w:t xml:space="preserve">Plataforma do Ministério da Saúde para acesso a serviços e informações digitais.</w:t>
+      </w:r>
+      <w:r>
+        <w:t xml:space="preserve"> </w:t>
+      </w:r>
+      <w:r>
+        <w:t xml:space="preserve">-</w:t>
+      </w:r>
+      <w:r>
+        <w:t xml:space="preserve"> </w:t>
+      </w:r>
+      <w:r>
+        <w:rPr>
+          <w:b/>
+          <w:bCs/>
+        </w:rPr>
+        <w:t xml:space="preserve">Fonte:</w:t>
+      </w:r>
+      <w:r>
+        <w:t xml:space="preserve"> </w:t>
+      </w:r>
+      <w:r>
+        <w:t xml:space="preserve">https://www.gov.br/saude/pt-br/composicao/seidigi/meususdigital</w:t>
+      </w:r>
+    </w:p>
     <w:p>
       <w:r>
         <w:pict>
@@ -633,15 +404,15 @@
         </w:pict>
       </w:r>
     </w:p>
-    <w:bookmarkEnd w:id="22"/>
-    <w:bookmarkEnd w:id="23"/>
-    <w:bookmarkStart w:id="24" w:name="estrutura-de-análise"/>
+    <w:bookmarkEnd w:id="28"/>
+    <w:bookmarkEnd w:id="29"/>
+    <w:bookmarkStart w:id="30" w:name="critérios-de-análise"/>
     <w:p>
       <w:pPr>
         <w:pStyle w:val="Heading2"/>
       </w:pPr>
       <w:r>
-        <w:t xml:space="preserve">Estrutura de Análise</w:t>
+        <w:t xml:space="preserve">3. Critérios de Análise</w:t>
       </w:r>
     </w:p>
     <w:p>
@@ -649,7 +420,7 @@
         <w:pStyle w:val="FirstParagraph"/>
       </w:pPr>
       <w:r>
-        <w:t xml:space="preserve">Cada caso está sendo analisado com:</w:t>
+        <w:t xml:space="preserve">Cada caso é avaliado segundo:</w:t>
       </w:r>
       <w:r>
         <w:t xml:space="preserve"> </w:t>
@@ -671,7 +442,7 @@
         <w:t xml:space="preserve"> </w:t>
       </w:r>
       <w:r>
-        <w:t xml:space="preserve">— o que é e como funciona</w:t>
+        <w:t xml:space="preserve">— funcionamento e escopo</w:t>
       </w:r>
       <w:r>
         <w:t xml:space="preserve"> </w:t>
@@ -693,7 +464,7 @@
         <w:t xml:space="preserve"> </w:t>
       </w:r>
       <w:r>
-        <w:t xml:space="preserve">— o que faz bem, incluindo aspectos de acessibilidade</w:t>
+        <w:t xml:space="preserve">— acertos, incluindo acessibilidade</w:t>
       </w:r>
       <w:r>
         <w:t xml:space="preserve"> </w:t>
@@ -715,7 +486,7 @@
         <w:t xml:space="preserve"> </w:t>
       </w:r>
       <w:r>
-        <w:t xml:space="preserve">— o que poderia melhorar (especialmente acessibilidade e integração)</w:t>
+        <w:t xml:space="preserve">— limitações, especialmente acessibilidade e integração</w:t>
       </w:r>
       <w:r>
         <w:t xml:space="preserve"> </w:t>
@@ -737,7 +508,7 @@
         <w:t xml:space="preserve"> </w:t>
       </w:r>
       <w:r>
-        <w:t xml:space="preserve">— o que podemos aproveitar ou superar</w:t>
+        <w:t xml:space="preserve">— inspirações e diferenciais</w:t>
       </w:r>
     </w:p>
     <w:p>
@@ -747,14 +518,14 @@
         </w:pict>
       </w:r>
     </w:p>
-    <w:bookmarkEnd w:id="24"/>
-    <w:bookmarkStart w:id="26" w:name="Xeddb8e051680fdc6d310acd28271397a6d04902"/>
+    <w:bookmarkEnd w:id="30"/>
+    <w:bookmarkStart w:id="31" w:name="diferenciais-do-minhafila"/>
     <w:p>
       <w:pPr>
         <w:pStyle w:val="Heading2"/>
       </w:pPr>
       <w:r>
-        <w:t xml:space="preserve">Diferenciais do MinhaFila em Relação aos Casos Existentes</w:t>
+        <w:t xml:space="preserve">4. Diferenciais do MinhaFila</w:t>
       </w:r>
     </w:p>
     <w:p>
@@ -770,10 +541,13 @@
           <w:b/>
           <w:bCs/>
         </w:rPr>
-        <w:t xml:space="preserve">Multissetorial</w:t>
-      </w:r>
-      <w:r>
-        <w:t xml:space="preserve">: funciona em saúde, bancos, educação, comércio e governo com uma única plataforma</w:t>
+        <w:t xml:space="preserve">Multissetorial:</w:t>
+      </w:r>
+      <w:r>
+        <w:t xml:space="preserve"> </w:t>
+      </w:r>
+      <w:r>
+        <w:t xml:space="preserve">saúde, bancos, educação, comércio e governo em uma única plataforma</w:t>
       </w:r>
     </w:p>
     <w:p>
@@ -789,10 +563,13 @@
           <w:b/>
           <w:bCs/>
         </w:rPr>
-        <w:t xml:space="preserve">Acessibilidade como recurso nativo</w:t>
-      </w:r>
-      <w:r>
-        <w:t xml:space="preserve">: contraste, leitores de tela, navegação por teclado, notificações visuais e sonoras</w:t>
+        <w:t xml:space="preserve">Acessibilidade nativa:</w:t>
+      </w:r>
+      <w:r>
+        <w:t xml:space="preserve"> </w:t>
+      </w:r>
+      <w:r>
+        <w:t xml:space="preserve">contraste ajustável, leitores de tela, navegação por teclado, notificações visuais e sonoras</w:t>
       </w:r>
     </w:p>
     <w:p>
@@ -808,10 +585,13 @@
           <w:b/>
           <w:bCs/>
         </w:rPr>
-        <w:t xml:space="preserve">Acompanhamento remoto</w:t>
-      </w:r>
-      <w:r>
-        <w:t xml:space="preserve">: usuário não precisa permanecer no local — recebe notificações da sua posição na fila</w:t>
+        <w:t xml:space="preserve">Acompanhamento remoto:</w:t>
+      </w:r>
+      <w:r>
+        <w:t xml:space="preserve"> </w:t>
+      </w:r>
+      <w:r>
+        <w:t xml:space="preserve">usuário acompanha a posição na fila sem precisar permanecer no local</w:t>
       </w:r>
     </w:p>
     <w:p>
@@ -827,10 +607,13 @@
           <w:b/>
           <w:bCs/>
         </w:rPr>
-        <w:t xml:space="preserve">Custo reduzido</w:t>
-      </w:r>
-      <w:r>
-        <w:t xml:space="preserve">: solução baseada em software, sem necessidade de totens físicos dedicados</w:t>
+        <w:t xml:space="preserve">Custo reduzido:</w:t>
+      </w:r>
+      <w:r>
+        <w:t xml:space="preserve"> </w:t>
+      </w:r>
+      <w:r>
+        <w:t xml:space="preserve">solução baseada em software, sem totens físicos dedicados</w:t>
       </w:r>
     </w:p>
     <w:p>
@@ -846,10 +629,13 @@
           <w:b/>
           <w:bCs/>
         </w:rPr>
-        <w:t xml:space="preserve">Relatórios em tempo real</w:t>
-      </w:r>
-      <w:r>
-        <w:t xml:space="preserve">: gestores podem monitorar filas, tempo médio de espera e gargalos</w:t>
+        <w:t xml:space="preserve">Relatórios em tempo real:</w:t>
+      </w:r>
+      <w:r>
+        <w:t xml:space="preserve"> </w:t>
+      </w:r>
+      <w:r>
+        <w:t xml:space="preserve">gestores monitoram filas, tempo de espera e gargalos</w:t>
       </w:r>
     </w:p>
     <w:p>
@@ -858,25 +644,6 @@
           <v:rect style="width:0;height:1.5pt" o:hralign="center" o:hrstd="t" o:hr="t"/>
         </w:pict>
       </w:r>
-    </w:p>
-    <w:p>
-      <w:pPr>
-        <w:pStyle w:val="BlockText"/>
-      </w:pPr>
-      <w:r>
-        <w:t xml:space="preserve">🔗</w:t>
-      </w:r>
-      <w:r>
-        <w:t xml:space="preserve"> </w:t>
-      </w:r>
-      <w:hyperlink r:id="rId25">
-        <w:r>
-          <w:rPr>
-            <w:rStyle w:val="Hyperlink"/>
-          </w:rPr>
-          <w:t xml:space="preserve">Voltar ao Index Geral</w:t>
-        </w:r>
-      </w:hyperlink>
     </w:p>
     <w:p>
       <w:pPr>
@@ -887,11 +654,11 @@
           <w:i/>
           <w:iCs/>
         </w:rPr>
-        <w:t xml:space="preserve">Este documento é atualizado a partir do Google Doc de trabalho da equipe (Ausiane + Núbia).</w:t>
-      </w:r>
-    </w:p>
-    <w:bookmarkEnd w:id="26"/>
-    <w:bookmarkEnd w:id="27"/>
+        <w:t xml:space="preserve">Documento associado ao Projeto Algoritmo I — GCETENS843 — UFRB 2026.1</w:t>
+      </w:r>
+    </w:p>
+    <w:bookmarkEnd w:id="31"/>
+    <w:bookmarkEnd w:id="32"/>
     <w:sectPr>
       <w:headerReference w:type="default" r:id="rId9"/>
       <w:footerReference w:type="default" r:id="rId10"/>

</xml_diff>

<commit_message>
refactor: alinha md e docx ao Projeto-Algoritmo-1-V2.docx + adiciona V2 no repo
</commit_message>
<xml_diff>
--- a/disciplinas/gcetens843-projeto-algoritmo-i/atividades/trabalhos/projeto-algoritmos/casos-existentes.docx
+++ b/disciplinas/gcetens843-projeto-algoritmo-i/atividades/trabalhos/projeto-algoritmos/casos-existentes.docx
@@ -2,7 +2,7 @@
 <file path=word/document.xml><?xml version="1.0" encoding="utf-8"?>
 <w:document xmlns:w="http://schemas.openxmlformats.org/wordprocessingml/2006/main" xmlns:m="http://schemas.openxmlformats.org/officeDocument/2006/math" xmlns:r="http://schemas.openxmlformats.org/officeDocument/2006/relationships" xmlns:o="urn:schemas-microsoft-com:office:office" xmlns:v="urn:schemas-microsoft-com:vml" xmlns:w10="urn:schemas-microsoft-com:office:word" xmlns:a="http://schemas.openxmlformats.org/drawingml/2006/main" xmlns:pic="http://schemas.openxmlformats.org/drawingml/2006/picture" xmlns:wp="http://schemas.openxmlformats.org/drawingml/2006/wordprocessingDrawing">
   <w:body>
-    <w:bookmarkStart w:id="32" w:name="casos-existentes-minhafila"/>
+    <w:bookmarkStart w:id="29" w:name="casos-existentes-minhafila"/>
     <w:p>
       <w:pPr>
         <w:pStyle w:val="Heading1"/>
@@ -52,22 +52,13 @@
         </w:pict>
       </w:r>
     </w:p>
-    <w:bookmarkStart w:id="25" w:name="sistemas-de-gerenciamento-de-filas-qms"/>
+    <w:bookmarkStart w:id="23" w:name="Xfc76b520fee546c236ff54b2e08f11736354c26"/>
     <w:p>
       <w:pPr>
         <w:pStyle w:val="Heading2"/>
       </w:pPr>
       <w:r>
-        <w:t xml:space="preserve">1. Sistemas de Gerenciamento de Filas (QMS)</w:t>
-      </w:r>
-    </w:p>
-    <w:bookmarkStart w:id="20" w:name="qmatic"/>
-    <w:p>
-      <w:pPr>
-        <w:pStyle w:val="Heading3"/>
-      </w:pPr>
-      <w:r>
-        <w:t xml:space="preserve">1.1 Qmatic</w:t>
+        <w:t xml:space="preserve">1. Sistemas de Gerenciamento de Filas disponíveis no mercado</w:t>
       </w:r>
     </w:p>
     <w:p>
@@ -75,457 +66,7 @@
         <w:pStyle w:val="FirstParagraph"/>
       </w:pPr>
       <w:r>
-        <w:t xml:space="preserve">Plataforma global de gerenciamento de filas com totens de autoatendimento, painéis de chamada e analytics. Atua em bancos, saúde, governo e varejo.</w:t>
-      </w:r>
-      <w:r>
-        <w:t xml:space="preserve"> </w:t>
-      </w:r>
-      <w:r>
-        <w:t xml:space="preserve">-</w:t>
-      </w:r>
-      <w:r>
-        <w:t xml:space="preserve"> </w:t>
-      </w:r>
-      <w:r>
-        <w:rPr>
-          <w:b/>
-          <w:bCs/>
-        </w:rPr>
-        <w:t xml:space="preserve">Site:</w:t>
-      </w:r>
-      <w:r>
-        <w:t xml:space="preserve"> </w:t>
-      </w:r>
-      <w:r>
-        <w:t xml:space="preserve">https://www.qmatic.com</w:t>
-      </w:r>
-    </w:p>
-    <w:bookmarkEnd w:id="20"/>
-    <w:bookmarkStart w:id="21" w:name="wavetec"/>
-    <w:p>
-      <w:pPr>
-        <w:pStyle w:val="Heading3"/>
-      </w:pPr>
-      <w:r>
-        <w:t xml:space="preserve">1.2 Wavetec</w:t>
-      </w:r>
-    </w:p>
-    <w:p>
-      <w:pPr>
-        <w:pStyle w:val="FirstParagraph"/>
-      </w:pPr>
-      <w:r>
-        <w:t xml:space="preserve">Sistema de filas com painéis eletrônicos, agendamento online e módulo de acessibilidade. Setores: saúde, educação, governo.</w:t>
-      </w:r>
-      <w:r>
-        <w:t xml:space="preserve"> </w:t>
-      </w:r>
-      <w:r>
-        <w:t xml:space="preserve">-</w:t>
-      </w:r>
-      <w:r>
-        <w:t xml:space="preserve"> </w:t>
-      </w:r>
-      <w:r>
-        <w:rPr>
-          <w:b/>
-          <w:bCs/>
-        </w:rPr>
-        <w:t xml:space="preserve">Site:</w:t>
-      </w:r>
-      <w:r>
-        <w:t xml:space="preserve"> </w:t>
-      </w:r>
-      <w:r>
-        <w:t xml:space="preserve">https://www.wavetec.com</w:t>
-      </w:r>
-    </w:p>
-    <w:bookmarkEnd w:id="21"/>
-    <w:bookmarkStart w:id="22" w:name="waitwhile"/>
-    <w:p>
-      <w:pPr>
-        <w:pStyle w:val="Heading3"/>
-      </w:pPr>
-      <w:r>
-        <w:t xml:space="preserve">1.3 Waitwhile</w:t>
-      </w:r>
-    </w:p>
-    <w:p>
-      <w:pPr>
-        <w:pStyle w:val="FirstParagraph"/>
-      </w:pPr>
-      <w:r>
-        <w:t xml:space="preserve">Plataforma de gestão de filas com check-in remoto, notificações SMS e métricas de espera. Varejo, saúde, serviços.</w:t>
-      </w:r>
-      <w:r>
-        <w:t xml:space="preserve"> </w:t>
-      </w:r>
-      <w:r>
-        <w:t xml:space="preserve">-</w:t>
-      </w:r>
-      <w:r>
-        <w:t xml:space="preserve"> </w:t>
-      </w:r>
-      <w:r>
-        <w:rPr>
-          <w:b/>
-          <w:bCs/>
-        </w:rPr>
-        <w:t xml:space="preserve">Site:</w:t>
-      </w:r>
-      <w:r>
-        <w:t xml:space="preserve"> </w:t>
-      </w:r>
-      <w:r>
-        <w:t xml:space="preserve">https://waitwhile.com</w:t>
-      </w:r>
-    </w:p>
-    <w:bookmarkEnd w:id="22"/>
-    <w:bookmarkStart w:id="23" w:name="senha-fácil"/>
-    <w:p>
-      <w:pPr>
-        <w:pStyle w:val="Heading3"/>
-      </w:pPr>
-      <w:r>
-        <w:t xml:space="preserve">1.4 Senha Fácil</w:t>
-      </w:r>
-    </w:p>
-    <w:p>
-      <w:pPr>
-        <w:pStyle w:val="FirstParagraph"/>
-      </w:pPr>
-      <w:r>
-        <w:t xml:space="preserve">Sistema brasileiro de distribuição eletrônica de senhas com painéis e relatórios. Bancos, clínicas, comércio.</w:t>
-      </w:r>
-      <w:r>
-        <w:t xml:space="preserve"> </w:t>
-      </w:r>
-      <w:r>
-        <w:t xml:space="preserve">-</w:t>
-      </w:r>
-      <w:r>
-        <w:t xml:space="preserve"> </w:t>
-      </w:r>
-      <w:r>
-        <w:rPr>
-          <w:b/>
-          <w:bCs/>
-        </w:rPr>
-        <w:t xml:space="preserve">Site:</w:t>
-      </w:r>
-      <w:r>
-        <w:t xml:space="preserve"> </w:t>
-      </w:r>
-      <w:r>
-        <w:t xml:space="preserve">https://www.senhafacil.com.br</w:t>
-      </w:r>
-    </w:p>
-    <w:bookmarkEnd w:id="23"/>
-    <w:bookmarkStart w:id="24" w:name="totvs-gestão-de-filas"/>
-    <w:p>
-      <w:pPr>
-        <w:pStyle w:val="Heading3"/>
-      </w:pPr>
-      <w:r>
-        <w:t xml:space="preserve">1.5 TOTVS Gestão de Filas</w:t>
-      </w:r>
-    </w:p>
-    <w:p>
-      <w:pPr>
-        <w:pStyle w:val="FirstParagraph"/>
-      </w:pPr>
-      <w:r>
-        <w:t xml:space="preserve">Solução integrada ao ecossistema TOTVS para controle de atendimento presencial. Varejo, saúde, serviços.</w:t>
-      </w:r>
-      <w:r>
-        <w:t xml:space="preserve"> </w:t>
-      </w:r>
-      <w:r>
-        <w:t xml:space="preserve">-</w:t>
-      </w:r>
-      <w:r>
-        <w:t xml:space="preserve"> </w:t>
-      </w:r>
-      <w:r>
-        <w:rPr>
-          <w:b/>
-          <w:bCs/>
-        </w:rPr>
-        <w:t xml:space="preserve">Site:</w:t>
-      </w:r>
-      <w:r>
-        <w:t xml:space="preserve"> </w:t>
-      </w:r>
-      <w:r>
-        <w:t xml:space="preserve">https://www.totvs.com</w:t>
-      </w:r>
-    </w:p>
-    <w:p>
-      <w:r>
-        <w:pict>
-          <v:rect style="width:0;height:1.5pt" o:hralign="center" o:hrstd="t" o:hr="t"/>
-        </w:pict>
-      </w:r>
-    </w:p>
-    <w:bookmarkEnd w:id="24"/>
-    <w:bookmarkEnd w:id="25"/>
-    <w:bookmarkStart w:id="29" w:name="iniciativas-governamentais"/>
-    <w:p>
-      <w:pPr>
-        <w:pStyle w:val="Heading2"/>
-      </w:pPr>
-      <w:r>
-        <w:t xml:space="preserve">2. Iniciativas Governamentais</w:t>
-      </w:r>
-    </w:p>
-    <w:bookmarkStart w:id="26" w:name="ia-monitora-filas-em-foz-do-iguaçu"/>
-    <w:p>
-      <w:pPr>
-        <w:pStyle w:val="Heading3"/>
-      </w:pPr>
-      <w:r>
-        <w:t xml:space="preserve">2.1 IA monitora filas em Foz do Iguaçu</w:t>
-      </w:r>
-    </w:p>
-    <w:p>
-      <w:pPr>
-        <w:pStyle w:val="FirstParagraph"/>
-      </w:pPr>
-      <w:r>
-        <w:t xml:space="preserve">Sistema de IA autônoma que monitora filas de consultas e serviços públicos com busca ativa automática.</w:t>
-      </w:r>
-      <w:r>
-        <w:t xml:space="preserve"> </w:t>
-      </w:r>
-      <w:r>
-        <w:t xml:space="preserve">-</w:t>
-      </w:r>
-      <w:r>
-        <w:t xml:space="preserve"> </w:t>
-      </w:r>
-      <w:r>
-        <w:rPr>
-          <w:b/>
-          <w:bCs/>
-        </w:rPr>
-        <w:t xml:space="preserve">Fonte:</w:t>
-      </w:r>
-      <w:r>
-        <w:t xml:space="preserve"> </w:t>
-      </w:r>
-      <w:r>
-        <w:t xml:space="preserve">https://www.foz.pr.gov.br/ia-passa-a-monitorar-filas-da-saude-primeira-infancia-e-atuacao-em-campo-de-agentes-comunitarios-de-saude/</w:t>
-      </w:r>
-    </w:p>
-    <w:bookmarkEnd w:id="26"/>
-    <w:bookmarkStart w:id="27" w:name="agir-atendimento-via-whatsapp-goiás"/>
-    <w:p>
-      <w:pPr>
-        <w:pStyle w:val="Heading3"/>
-      </w:pPr>
-      <w:r>
-        <w:t xml:space="preserve">2.2 Agir – Atendimento via WhatsApp (Goiás)</w:t>
-      </w:r>
-    </w:p>
-    <w:p>
-      <w:pPr>
-        <w:pStyle w:val="FirstParagraph"/>
-      </w:pPr>
-      <w:r>
-        <w:t xml:space="preserve">Transformação digital com atendimento por WhatsApp em unidades de saúde.</w:t>
-      </w:r>
-      <w:r>
-        <w:t xml:space="preserve"> </w:t>
-      </w:r>
-      <w:r>
-        <w:t xml:space="preserve">-</w:t>
-      </w:r>
-      <w:r>
-        <w:t xml:space="preserve"> </w:t>
-      </w:r>
-      <w:r>
-        <w:rPr>
-          <w:b/>
-          <w:bCs/>
-        </w:rPr>
-        <w:t xml:space="preserve">Fonte:</w:t>
-      </w:r>
-      <w:r>
-        <w:t xml:space="preserve"> </w:t>
-      </w:r>
-      <w:r>
-        <w:t xml:space="preserve">https://www.agirsaude.org.br/noticia/view/4548/agir-acelera-transformacao-digital-na-saude-publica-com-atendimento-via-whatsapp-em-hospitais-de-goias</w:t>
-      </w:r>
-    </w:p>
-    <w:bookmarkEnd w:id="27"/>
-    <w:bookmarkStart w:id="28" w:name="meu-sus-digital"/>
-    <w:p>
-      <w:pPr>
-        <w:pStyle w:val="Heading3"/>
-      </w:pPr>
-      <w:r>
-        <w:t xml:space="preserve">2.3 Meu SUS Digital</w:t>
-      </w:r>
-    </w:p>
-    <w:p>
-      <w:pPr>
-        <w:pStyle w:val="FirstParagraph"/>
-      </w:pPr>
-      <w:r>
-        <w:t xml:space="preserve">Plataforma do Ministério da Saúde para acesso a serviços e informações digitais.</w:t>
-      </w:r>
-      <w:r>
-        <w:t xml:space="preserve"> </w:t>
-      </w:r>
-      <w:r>
-        <w:t xml:space="preserve">-</w:t>
-      </w:r>
-      <w:r>
-        <w:t xml:space="preserve"> </w:t>
-      </w:r>
-      <w:r>
-        <w:rPr>
-          <w:b/>
-          <w:bCs/>
-        </w:rPr>
-        <w:t xml:space="preserve">Fonte:</w:t>
-      </w:r>
-      <w:r>
-        <w:t xml:space="preserve"> </w:t>
-      </w:r>
-      <w:r>
-        <w:t xml:space="preserve">https://www.gov.br/saude/pt-br/composicao/seidigi/meususdigital</w:t>
-      </w:r>
-    </w:p>
-    <w:p>
-      <w:r>
-        <w:pict>
-          <v:rect style="width:0;height:1.5pt" o:hralign="center" o:hrstd="t" o:hr="t"/>
-        </w:pict>
-      </w:r>
-    </w:p>
-    <w:bookmarkEnd w:id="28"/>
-    <w:bookmarkEnd w:id="29"/>
-    <w:bookmarkStart w:id="30" w:name="critérios-de-análise"/>
-    <w:p>
-      <w:pPr>
-        <w:pStyle w:val="Heading2"/>
-      </w:pPr>
-      <w:r>
-        <w:t xml:space="preserve">3. Critérios de Análise</w:t>
-      </w:r>
-    </w:p>
-    <w:p>
-      <w:pPr>
-        <w:pStyle w:val="FirstParagraph"/>
-      </w:pPr>
-      <w:r>
-        <w:t xml:space="preserve">Cada caso é avaliado segundo:</w:t>
-      </w:r>
-      <w:r>
-        <w:t xml:space="preserve"> </w:t>
-      </w:r>
-      <w:r>
-        <w:t xml:space="preserve">-</w:t>
-      </w:r>
-      <w:r>
-        <w:t xml:space="preserve"> </w:t>
-      </w:r>
-      <w:r>
-        <w:rPr>
-          <w:b/>
-          <w:bCs/>
-        </w:rPr>
-        <w:t xml:space="preserve">Descrição</w:t>
-      </w:r>
-      <w:r>
-        <w:t xml:space="preserve"> </w:t>
-      </w:r>
-      <w:r>
-        <w:t xml:space="preserve">— funcionamento e escopo</w:t>
-      </w:r>
-      <w:r>
-        <w:t xml:space="preserve"> </w:t>
-      </w:r>
-      <w:r>
-        <w:t xml:space="preserve">-</w:t>
-      </w:r>
-      <w:r>
-        <w:t xml:space="preserve"> </w:t>
-      </w:r>
-      <w:r>
-        <w:rPr>
-          <w:b/>
-          <w:bCs/>
-        </w:rPr>
-        <w:t xml:space="preserve">Pontos fortes</w:t>
-      </w:r>
-      <w:r>
-        <w:t xml:space="preserve"> </w:t>
-      </w:r>
-      <w:r>
-        <w:t xml:space="preserve">— acertos, incluindo acessibilidade</w:t>
-      </w:r>
-      <w:r>
-        <w:t xml:space="preserve"> </w:t>
-      </w:r>
-      <w:r>
-        <w:t xml:space="preserve">-</w:t>
-      </w:r>
-      <w:r>
-        <w:t xml:space="preserve"> </w:t>
-      </w:r>
-      <w:r>
-        <w:rPr>
-          <w:b/>
-          <w:bCs/>
-        </w:rPr>
-        <w:t xml:space="preserve">Lacunas</w:t>
-      </w:r>
-      <w:r>
-        <w:t xml:space="preserve"> </w:t>
-      </w:r>
-      <w:r>
-        <w:t xml:space="preserve">— limitações, especialmente acessibilidade e integração</w:t>
-      </w:r>
-      <w:r>
-        <w:t xml:space="preserve"> </w:t>
-      </w:r>
-      <w:r>
-        <w:t xml:space="preserve">-</w:t>
-      </w:r>
-      <w:r>
-        <w:t xml:space="preserve"> </w:t>
-      </w:r>
-      <w:r>
-        <w:rPr>
-          <w:b/>
-          <w:bCs/>
-        </w:rPr>
-        <w:t xml:space="preserve">Relevância para o MinhaFila</w:t>
-      </w:r>
-      <w:r>
-        <w:t xml:space="preserve"> </w:t>
-      </w:r>
-      <w:r>
-        <w:t xml:space="preserve">— inspirações e diferenciais</w:t>
-      </w:r>
-    </w:p>
-    <w:p>
-      <w:r>
-        <w:pict>
-          <v:rect style="width:0;height:1.5pt" o:hralign="center" o:hrstd="t" o:hr="t"/>
-        </w:pict>
-      </w:r>
-    </w:p>
-    <w:bookmarkEnd w:id="30"/>
-    <w:bookmarkStart w:id="31" w:name="diferenciais-do-minhafila"/>
-    <w:p>
-      <w:pPr>
-        <w:pStyle w:val="Heading2"/>
-      </w:pPr>
-      <w:r>
-        <w:t xml:space="preserve">4. Diferenciais do MinhaFila</w:t>
+        <w:t xml:space="preserve">Existem alguns sistemas disponíveis no mercado que auxiliam na gestão de filas:</w:t>
       </w:r>
     </w:p>
     <w:p>
@@ -541,13 +82,24 @@
           <w:b/>
           <w:bCs/>
         </w:rPr>
-        <w:t xml:space="preserve">Multissetorial:</w:t>
+        <w:t xml:space="preserve">NextQS</w:t>
       </w:r>
       <w:r>
         <w:t xml:space="preserve"> </w:t>
       </w:r>
       <w:r>
-        <w:t xml:space="preserve">saúde, bancos, educação, comércio e governo em uma única plataforma</w:t>
+        <w:t xml:space="preserve">— sistema de gerenciamento de filas com totens de autoatendimento e painéis de chamada. (</w:t>
+      </w:r>
+      <w:hyperlink r:id="rId20">
+        <w:r>
+          <w:rPr>
+            <w:rStyle w:val="Hyperlink"/>
+          </w:rPr>
+          <w:t xml:space="preserve">https://www.nextqs.com/</w:t>
+        </w:r>
+      </w:hyperlink>
+      <w:r>
+        <w:t xml:space="preserve">)</w:t>
       </w:r>
     </w:p>
     <w:p>
@@ -563,13 +115,24 @@
           <w:b/>
           <w:bCs/>
         </w:rPr>
-        <w:t xml:space="preserve">Acessibilidade nativa:</w:t>
+        <w:t xml:space="preserve">Fila Online</w:t>
       </w:r>
       <w:r>
         <w:t xml:space="preserve"> </w:t>
       </w:r>
       <w:r>
-        <w:t xml:space="preserve">contraste ajustável, leitores de tela, navegação por teclado, notificações visuais e sonoras</w:t>
+        <w:t xml:space="preserve">— envia alertas sobre o status da fila por notificação. (</w:t>
+      </w:r>
+      <w:hyperlink r:id="rId21">
+        <w:r>
+          <w:rPr>
+            <w:rStyle w:val="Hyperlink"/>
+          </w:rPr>
+          <w:t xml:space="preserve">https://filaonlineapp.com.br/</w:t>
+        </w:r>
+      </w:hyperlink>
+      <w:r>
+        <w:t xml:space="preserve">)</w:t>
       </w:r>
     </w:p>
     <w:p>
@@ -585,57 +148,90 @@
           <w:b/>
           <w:bCs/>
         </w:rPr>
-        <w:t xml:space="preserve">Acompanhamento remoto:</w:t>
+        <w:t xml:space="preserve">Vizitor</w:t>
       </w:r>
       <w:r>
         <w:t xml:space="preserve"> </w:t>
       </w:r>
       <w:r>
-        <w:t xml:space="preserve">usuário acompanha a posição na fila sem precisar permanecer no local</w:t>
+        <w:t xml:space="preserve">— unifica o check-in de visitantes, a reserva de mesas e salas, as entregas, a presença, as filas e os fluxos de trabalho da recepção em uma única plataforma. Emite senhas digitais, gerencia balcões de atendimento e notifica os usuários quando for a sua vez. (</w:t>
+      </w:r>
+      <w:hyperlink r:id="rId22">
+        <w:r>
+          <w:rPr>
+            <w:rStyle w:val="Hyperlink"/>
+          </w:rPr>
+          <w:t xml:space="preserve">https://www.vizitorapp.com/</w:t>
+        </w:r>
+      </w:hyperlink>
+      <w:r>
+        <w:t xml:space="preserve">)</w:t>
+      </w:r>
+    </w:p>
+    <w:bookmarkEnd w:id="23"/>
+    <w:bookmarkStart w:id="24" w:name="legislação-e-autorregulamentação"/>
+    <w:p>
+      <w:pPr>
+        <w:pStyle w:val="Heading2"/>
+      </w:pPr>
+      <w:r>
+        <w:t xml:space="preserve">2. Legislação e autorregulamentação</w:t>
       </w:r>
     </w:p>
     <w:p>
       <w:pPr>
-        <w:pStyle w:val="Compact"/>
-        <w:numPr>
-          <w:ilvl w:val="0"/>
-          <w:numId w:val="1001"/>
-        </w:numPr>
-      </w:pPr>
+        <w:pStyle w:val="FirstParagraph"/>
+      </w:pPr>
+      <w:r>
+        <w:t xml:space="preserve">Diversas cidades e estados brasileiros possuem leis que limitam o tempo máximo de espera nas agências, casas lotéricas e correspondentes bancários. Por serem locais, as</w:t>
+      </w:r>
+      <w:r>
+        <w:t xml:space="preserve"> </w:t>
+      </w:r>
+      <w:r>
+        <w:t xml:space="preserve">“leis da fila”</w:t>
+      </w:r>
+      <w:r>
+        <w:t xml:space="preserve"> </w:t>
+      </w:r>
+      <w:r>
+        <w:t xml:space="preserve">não têm regras uniformes. Algumas estabelecem que a espera não pode passar de 15 minutos em dia de movimento normal, enquanto outros estabelecem limites menos rígidos. Além disso, uma norma de autorregulação da Febraban (Federação Brasileira de Bancos) define que o tempo máximo de espera nas filas de bancos deve ser de até 20 minutos em dias de movimento normal, e de até 30 minutos nos de pico. A regra é voluntária, mas todos os grandes bancos são signatários (Idec, 2017).</w:t>
+      </w:r>
+    </w:p>
+    <w:bookmarkEnd w:id="24"/>
+    <w:bookmarkStart w:id="25" w:name="lacuna-das-soluções-existentes"/>
+    <w:p>
+      <w:pPr>
+        <w:pStyle w:val="Heading2"/>
+      </w:pPr>
+      <w:r>
+        <w:t xml:space="preserve">3. Lacuna das soluções existentes</w:t>
+      </w:r>
+    </w:p>
+    <w:p>
+      <w:pPr>
+        <w:pStyle w:val="FirstParagraph"/>
+      </w:pPr>
+      <w:r>
+        <w:t xml:space="preserve">Embora as soluções referidas estejam disponíveis no mercado e representem avanços que integram o uso de tecnologias ao gerenciamento de filas, uma das principais limitações delas é</w:t>
+      </w:r>
+      <w:r>
+        <w:t xml:space="preserve"> </w:t>
+      </w:r>
       <w:r>
         <w:rPr>
           <w:b/>
           <w:bCs/>
         </w:rPr>
-        <w:t xml:space="preserve">Custo reduzido:</w:t>
-      </w:r>
-      <w:r>
-        <w:t xml:space="preserve"> </w:t>
-      </w:r>
-      <w:r>
-        <w:t xml:space="preserve">solução baseada em software, sem totens físicos dedicados</w:t>
+        <w:t xml:space="preserve">não informar ao usuário o tempo aproximado de espera até o seu atendimento durante o período em que o mesmo se encontra na fila.</w:t>
       </w:r>
     </w:p>
     <w:p>
       <w:pPr>
-        <w:pStyle w:val="Compact"/>
-        <w:numPr>
-          <w:ilvl w:val="0"/>
-          <w:numId w:val="1001"/>
-        </w:numPr>
-      </w:pPr>
-      <w:r>
-        <w:rPr>
-          <w:b/>
-          <w:bCs/>
-        </w:rPr>
-        <w:t xml:space="preserve">Relatórios em tempo real:</w:t>
-      </w:r>
-      <w:r>
-        <w:t xml:space="preserve"> </w:t>
-      </w:r>
-      <w:r>
-        <w:t xml:space="preserve">gestores monitoram filas, tempo de espera e gargalos</w:t>
+        <w:pStyle w:val="BodyText"/>
+      </w:pPr>
+      <w:r>
+        <w:t xml:space="preserve">Essa lacuna é o ponto de partida para o desenvolvimento do MinhaFila: uma solução que não apenas gerencie a ordem de atendimento, mas forneça previsibilidade de espera em tempo real, acessibilidade multiplataforma e acompanhamento remoto.</w:t>
       </w:r>
     </w:p>
     <w:p>
@@ -645,20 +241,62 @@
         </w:pict>
       </w:r>
     </w:p>
+    <w:bookmarkEnd w:id="25"/>
+    <w:bookmarkStart w:id="28" w:name="referências"/>
     <w:p>
       <w:pPr>
+        <w:pStyle w:val="Heading2"/>
+      </w:pPr>
+      <w:r>
+        <w:t xml:space="preserve">4. Referências</w:t>
+      </w:r>
+    </w:p>
+    <w:p>
+      <w:pPr>
         <w:pStyle w:val="FirstParagraph"/>
       </w:pPr>
       <w:r>
-        <w:rPr>
-          <w:i/>
-          <w:iCs/>
-        </w:rPr>
-        <w:t xml:space="preserve">Documento associado ao Projeto Algoritmo I — GCETENS843 — UFRB 2026.1</w:t>
+        <w:t xml:space="preserve">IDEC. Fila de banco demorada? Saiba seus direitos, 2017. Disponível em:</w:t>
+      </w:r>
+      <w:r>
+        <w:t xml:space="preserve"> </w:t>
+      </w:r>
+      <w:hyperlink r:id="rId26">
+        <w:r>
+          <w:rPr>
+            <w:rStyle w:val="Hyperlink"/>
+          </w:rPr>
+          <w:t xml:space="preserve">https://idec.org.br/dicas-e-direitos/fila-de-banco-demorada-saiba-seus-direitos</w:t>
+        </w:r>
+      </w:hyperlink>
+      <w:r>
+        <w:t xml:space="preserve">. Acesso em: 28 jun. 2026.</w:t>
       </w:r>
     </w:p>
-    <w:bookmarkEnd w:id="31"/>
-    <w:bookmarkEnd w:id="32"/>
+    <w:p>
+      <w:pPr>
+        <w:pStyle w:val="BodyText"/>
+      </w:pPr>
+      <w:r>
+        <w:t xml:space="preserve">WAITWHILE. Consumer Survey: The State of Waiting in Line. San Francisco: Waitwhile, 2024. Disponível em:</w:t>
+      </w:r>
+      <w:r>
+        <w:t xml:space="preserve"> </w:t>
+      </w:r>
+      <w:hyperlink r:id="rId27">
+        <w:r>
+          <w:rPr>
+            <w:rStyle w:val="Hyperlink"/>
+          </w:rPr>
+          <w:t xml:space="preserve">https://waitwhile.com/blog/consumer-survey-waiting-in-line-2024/</w:t>
+        </w:r>
+      </w:hyperlink>
+      <w:r>
+        <w:t xml:space="preserve">. Acesso em: 28 jun. 2026.</w:t>
+      </w:r>
+    </w:p>
+    <w:bookmarkEnd w:id="28"/>
+    <w:bookmarkEnd w:id="29"/>
     <w:sectPr>
       <w:headerReference w:type="default" r:id="rId9"/>
       <w:footerReference w:type="default" r:id="rId10"/>

</xml_diff>

<commit_message>
docs: atualiza documentos MinhaFila com base em V2 (Rios) e corrige header UFRB
- proposta.md: reformulado para texto puro acadêmico, cita Rios
- casos-existentes.md: estrutura coesa com introdução e encaminhamento
- problema-real.md: adicionada fonte-base V2
- gerar-molde-ufrb.py: insere capa única (1x logo) em vez de header
- regenerados .docx com nova capa UFRB (problema-real, proposta, casos-existentes, fluxograma)
</commit_message>
<xml_diff>
--- a/disciplinas/gcetens843-projeto-algoritmo-i/atividades/trabalhos/projeto-algoritmos/casos-existentes.docx
+++ b/disciplinas/gcetens843-projeto-algoritmo-i/atividades/trabalhos/projeto-algoritmos/casos-existentes.docx
@@ -2,7 +2,131 @@
 <file path=word/document.xml><?xml version="1.0" encoding="utf-8"?>
 <w:document xmlns:w="http://schemas.openxmlformats.org/wordprocessingml/2006/main" xmlns:m="http://schemas.openxmlformats.org/officeDocument/2006/math" xmlns:r="http://schemas.openxmlformats.org/officeDocument/2006/relationships" xmlns:o="urn:schemas-microsoft-com:office:office" xmlns:v="urn:schemas-microsoft-com:vml" xmlns:w10="urn:schemas-microsoft-com:office:word" xmlns:a="http://schemas.openxmlformats.org/drawingml/2006/main" xmlns:pic="http://schemas.openxmlformats.org/drawingml/2006/picture" xmlns:wp="http://schemas.openxmlformats.org/drawingml/2006/wordprocessingDrawing">
   <w:body>
-    <w:bookmarkStart w:id="29" w:name="casos-existentes-minhafila"/>
+    <w:bookmarkStart w:id="30" w:name="casos-existentes-minhafila"/>
+    <w:tbl>
+      <w:tblPr>
+        <w:tblW w:type="auto" w:w="0"/>
+        <w:tblLayout w:type="fixed"/>
+        <w:tblLook w:firstColumn="1" w:firstRow="1" w:lastColumn="0" w:lastRow="0" w:noHBand="0" w:noVBand="1" w:val="04A0"/>
+        <w:tblBorders>
+          <w:top w:val="none" w:sz="0" w:space="0" w:color="auto"/>
+          <w:left w:val="none" w:sz="0" w:space="0" w:color="auto"/>
+          <w:bottom w:val="none" w:sz="0" w:space="0" w:color="auto"/>
+          <w:right w:val="none" w:sz="0" w:space="0" w:color="auto"/>
+        </w:tblBorders>
+      </w:tblPr>
+      <w:tblGrid>
+        <w:gridCol w:w="4680"/>
+        <w:gridCol w:w="4680"/>
+      </w:tblGrid>
+      <w:tr>
+        <w:tc>
+          <w:tcPr>
+            <w:tcW w:type="dxa" w:w="2016"/>
+          </w:tcPr>
+          <w:p>
+            <w:pPr>
+              <w:jc w:val="left"/>
+            </w:pPr>
+            <w:r>
+              <w:drawing>
+                <wp:inline>
+                  <wp:extent cx="1143000" cy="450211"/>
+                  <wp:docPr id="1" name="Picture 1"/>
+                  <wp:cNvGraphicFramePr>
+                    <a:graphicFrameLocks noChangeAspect="1"/>
+                  </wp:cNvGraphicFramePr>
+                  <a:graphic>
+                    <a:graphicData uri="http://schemas.openxmlformats.org/drawingml/2006/picture">
+                      <pic:pic>
+                        <pic:nvPicPr>
+                          <pic:cNvPr id="0" name="logo-ufrb-20-anos.png"/>
+                          <pic:cNvPicPr/>
+                        </pic:nvPicPr>
+                        <pic:blipFill>
+                          <a:blip r:embed="rId9"/>
+                          <a:stretch>
+                            <a:fillRect/>
+                          </a:stretch>
+                        </pic:blipFill>
+                        <pic:spPr>
+                          <a:xfrm>
+                            <a:off x="0" y="0"/>
+                            <a:ext cx="1143000" cy="450211"/>
+                          </a:xfrm>
+                          <a:prstGeom prst="rect"/>
+                        </pic:spPr>
+                      </pic:pic>
+                    </a:graphicData>
+                  </a:graphic>
+                </wp:inline>
+              </w:drawing>
+            </w:r>
+          </w:p>
+        </w:tc>
+        <w:tc>
+          <w:tcPr>
+            <w:tcW w:type="dxa" w:w="7200"/>
+          </w:tcPr>
+          <w:p>
+            <w:pPr>
+              <w:jc w:val="left"/>
+            </w:pPr>
+            <w:r>
+              <w:rPr>
+                <w:rFonts w:ascii="Times New Roman" w:hAnsi="Times New Roman"/>
+                <w:b/>
+                <w:color w:val="003D6B"/>
+                <w:sz w:val="16"/>
+              </w:rPr>
+              <w:t>UNIVERSIDADE FEDERAL DO RECÔNCAVO DA BAHIA — UFRB</w:t>
+            </w:r>
+          </w:p>
+          <w:p>
+            <w:pPr>
+              <w:jc w:val="left"/>
+            </w:pPr>
+            <w:r>
+              <w:rPr>
+                <w:rFonts w:ascii="Times New Roman" w:hAnsi="Times New Roman"/>
+                <w:b/>
+                <w:color w:val="006DAA"/>
+                <w:sz w:val="15"/>
+              </w:rPr>
+              <w:t>CENTRO DE CIÊNCIA E TECNOLOGIA — CETENS</w:t>
+            </w:r>
+          </w:p>
+          <w:p>
+            <w:pPr>
+              <w:jc w:val="left"/>
+            </w:pPr>
+            <w:r>
+              <w:rPr>
+                <w:rFonts w:ascii="Times New Roman" w:hAnsi="Times New Roman"/>
+                <w:b w:val="0"/>
+                <w:color w:val="505050"/>
+                <w:sz w:val="14"/>
+              </w:rPr>
+              <w:t>BACHARELADO EM SISTEMAS DE INFORMAÇÃO (EAD)</w:t>
+            </w:r>
+          </w:p>
+          <w:p>
+            <w:pPr>
+              <w:jc w:val="left"/>
+            </w:pPr>
+            <w:r>
+              <w:rPr>
+                <w:rFonts w:ascii="Times New Roman" w:hAnsi="Times New Roman"/>
+                <w:b w:val="0"/>
+                <w:color w:val="C89B3C"/>
+                <w:sz w:val="8"/>
+              </w:rPr>
+              <w:t>────────────────────────────────────────────────────────────────────────────────</w:t>
+            </w:r>
+          </w:p>
+        </w:tc>
+      </w:tr>
+    </w:tbl>
     <w:p>
       <w:pPr>
         <w:pStyle w:val="Heading1"/>
@@ -52,13 +176,13 @@
         </w:pict>
       </w:r>
     </w:p>
-    <w:bookmarkStart w:id="23" w:name="Xfc76b520fee546c236ff54b2e08f11736354c26"/>
+    <w:bookmarkStart w:id="20" w:name="introdução"/>
     <w:p>
       <w:pPr>
         <w:pStyle w:val="Heading2"/>
       </w:pPr>
       <w:r>
-        <w:t xml:space="preserve">1. Sistemas de Gerenciamento de Filas disponíveis no mercado</w:t>
+        <w:t xml:space="preserve">1. Introdução</w:t>
       </w:r>
     </w:p>
     <w:p>
@@ -66,12 +190,36 @@
         <w:pStyle w:val="FirstParagraph"/>
       </w:pPr>
       <w:r>
+        <w:t xml:space="preserve">Esta seção apresenta a análise de soluções de gerenciamento de filas disponíveis no mercado e o arcabouço legal brasileiro que moldam o contexto de atuação do MinhaFila. O objetivo é identificar as lacunas das soluções atuais e justificar a necessidade de um sistema multissetorial e acessível como o proposto.</w:t>
+      </w:r>
+    </w:p>
+    <w:p>
+      <w:r>
+        <w:pict>
+          <v:rect style="width:0;height:1.5pt" o:hralign="center" o:hrstd="t" o:hr="t"/>
+        </w:pict>
+      </w:r>
+    </w:p>
+    <w:bookmarkEnd w:id="20"/>
+    <w:bookmarkStart w:id="24" w:name="Xfc76b520fee546c236ff54b2e08f11736354c26"/>
+    <w:p>
+      <w:pPr>
+        <w:pStyle w:val="Heading2"/>
+      </w:pPr>
+      <w:r>
+        <w:t xml:space="preserve">2. Sistemas de Gerenciamento de Filas Disponíveis no Mercado</w:t>
+      </w:r>
+    </w:p>
+    <w:p>
+      <w:pPr>
+        <w:pStyle w:val="FirstParagraph"/>
+      </w:pPr>
+      <w:r>
         <w:t xml:space="preserve">Existem alguns sistemas disponíveis no mercado que auxiliam na gestão de filas:</w:t>
       </w:r>
     </w:p>
     <w:p>
       <w:pPr>
-        <w:pStyle w:val="Compact"/>
         <w:numPr>
           <w:ilvl w:val="0"/>
           <w:numId w:val="1001"/>
@@ -88,9 +236,18 @@
         <w:t xml:space="preserve"> </w:t>
       </w:r>
       <w:r>
-        <w:t xml:space="preserve">— sistema de gerenciamento de filas com totens de autoatendimento e painéis de chamada. (</w:t>
-      </w:r>
-      <w:hyperlink r:id="rId20">
+        <w:t xml:space="preserve">— sistema de gerenciamento de filas com totens de autoatendimento e painéis de chamada.</w:t>
+      </w:r>
+      <w:r>
+        <w:br/>
+      </w:r>
+      <w:r>
+        <w:t xml:space="preserve">Disponível em:</w:t>
+      </w:r>
+      <w:r>
+        <w:t xml:space="preserve"> </w:t>
+      </w:r>
+      <w:hyperlink r:id="rId21">
         <w:r>
           <w:rPr>
             <w:rStyle w:val="Hyperlink"/>
@@ -98,13 +255,9 @@
           <w:t xml:space="preserve">https://www.nextqs.com/</w:t>
         </w:r>
       </w:hyperlink>
-      <w:r>
-        <w:t xml:space="preserve">)</w:t>
-      </w:r>
-    </w:p>
-    <w:p>
-      <w:pPr>
-        <w:pStyle w:val="Compact"/>
+    </w:p>
+    <w:p>
+      <w:pPr>
         <w:numPr>
           <w:ilvl w:val="0"/>
           <w:numId w:val="1001"/>
@@ -121,9 +274,18 @@
         <w:t xml:space="preserve"> </w:t>
       </w:r>
       <w:r>
-        <w:t xml:space="preserve">— envia alertas sobre o status da fila por notificação. (</w:t>
-      </w:r>
-      <w:hyperlink r:id="rId21">
+        <w:t xml:space="preserve">— envia alertas sobre o status da fila por notificação.</w:t>
+      </w:r>
+      <w:r>
+        <w:br/>
+      </w:r>
+      <w:r>
+        <w:t xml:space="preserve">Disponível em:</w:t>
+      </w:r>
+      <w:r>
+        <w:t xml:space="preserve"> </w:t>
+      </w:r>
+      <w:hyperlink r:id="rId22">
         <w:r>
           <w:rPr>
             <w:rStyle w:val="Hyperlink"/>
@@ -131,13 +293,9 @@
           <w:t xml:space="preserve">https://filaonlineapp.com.br/</w:t>
         </w:r>
       </w:hyperlink>
-      <w:r>
-        <w:t xml:space="preserve">)</w:t>
-      </w:r>
-    </w:p>
-    <w:p>
-      <w:pPr>
-        <w:pStyle w:val="Compact"/>
+    </w:p>
+    <w:p>
+      <w:pPr>
         <w:numPr>
           <w:ilvl w:val="0"/>
           <w:numId w:val="1001"/>
@@ -154,9 +312,18 @@
         <w:t xml:space="preserve"> </w:t>
       </w:r>
       <w:r>
-        <w:t xml:space="preserve">— unifica o check-in de visitantes, a reserva de mesas e salas, as entregas, a presença, as filas e os fluxos de trabalho da recepção em uma única plataforma. Emite senhas digitais, gerencia balcões de atendimento e notifica os usuários quando for a sua vez. (</w:t>
-      </w:r>
-      <w:hyperlink r:id="rId22">
+        <w:t xml:space="preserve">— unifica o check-in de visitantes, a reserva de mesas e salas, as entregas, a presença, as filas e os fluxos de trabalho da recepção em uma única plataforma. Emite senhas digitais, gerencia balcões de atendimento e notifica os usuários quando for a sua vez.</w:t>
+      </w:r>
+      <w:r>
+        <w:br/>
+      </w:r>
+      <w:r>
+        <w:t xml:space="preserve">Disponível em:</w:t>
+      </w:r>
+      <w:r>
+        <w:t xml:space="preserve"> </w:t>
+      </w:r>
+      <w:hyperlink r:id="rId23">
         <w:r>
           <w:rPr>
             <w:rStyle w:val="Hyperlink"/>
@@ -164,18 +331,22 @@
           <w:t xml:space="preserve">https://www.vizitorapp.com/</w:t>
         </w:r>
       </w:hyperlink>
-      <w:r>
-        <w:t xml:space="preserve">)</w:t>
-      </w:r>
-    </w:p>
-    <w:bookmarkEnd w:id="23"/>
-    <w:bookmarkStart w:id="24" w:name="legislação-e-autorregulamentação"/>
+    </w:p>
+    <w:p>
+      <w:r>
+        <w:pict>
+          <v:rect style="width:0;height:1.5pt" o:hralign="center" o:hrstd="t" o:hr="t"/>
+        </w:pict>
+      </w:r>
+    </w:p>
+    <w:bookmarkEnd w:id="24"/>
+    <w:bookmarkStart w:id="25" w:name="legislação-e-autorregulamentação"/>
     <w:p>
       <w:pPr>
         <w:pStyle w:val="Heading2"/>
       </w:pPr>
       <w:r>
-        <w:t xml:space="preserve">2. Legislação e autorregulamentação</w:t>
+        <w:t xml:space="preserve">3. Legislação e Autorregulamentação</w:t>
       </w:r>
     </w:p>
     <w:p>
@@ -195,17 +366,32 @@
         <w:t xml:space="preserve"> </w:t>
       </w:r>
       <w:r>
-        <w:t xml:space="preserve">não têm regras uniformes. Algumas estabelecem que a espera não pode passar de 15 minutos em dia de movimento normal, enquanto outros estabelecem limites menos rígidos. Além disso, uma norma de autorregulação da Febraban (Federação Brasileira de Bancos) define que o tempo máximo de espera nas filas de bancos deve ser de até 20 minutos em dias de movimento normal, e de até 30 minutos nos de pico. A regra é voluntária, mas todos os grandes bancos são signatários (Idec, 2017).</w:t>
-      </w:r>
-    </w:p>
-    <w:bookmarkEnd w:id="24"/>
-    <w:bookmarkStart w:id="25" w:name="lacuna-das-soluções-existentes"/>
+        <w:t xml:space="preserve">não têm regras uniformes. Algumas estabelecem que a espera não pode passar de 15 minutos em dia de movimento normal, enquanto outros estabelecem limites menos rígidos.</w:t>
+      </w:r>
+    </w:p>
+    <w:p>
+      <w:pPr>
+        <w:pStyle w:val="BodyText"/>
+      </w:pPr>
+      <w:r>
+        <w:t xml:space="preserve">Além disso, uma norma de autorregulação da Febraban (Federação Brasileira de Bancos) define que o tempo máximo de espera nas filas de bancos deve ser de até 20 minutos em dias de movimento normal, e de até 30 minutos nos de pico. A regra é voluntária, mas todos os grandes bancos são signatários (Idec, 2017).</w:t>
+      </w:r>
+    </w:p>
+    <w:p>
+      <w:r>
+        <w:pict>
+          <v:rect style="width:0;height:1.5pt" o:hralign="center" o:hrstd="t" o:hr="t"/>
+        </w:pict>
+      </w:r>
+    </w:p>
+    <w:bookmarkEnd w:id="25"/>
+    <w:bookmarkStart w:id="26" w:name="lacuna-das-soluções-existentes"/>
     <w:p>
       <w:pPr>
         <w:pStyle w:val="Heading2"/>
       </w:pPr>
       <w:r>
-        <w:t xml:space="preserve">3. Lacuna das soluções existentes</w:t>
+        <w:t xml:space="preserve">4. Lacuna das Soluções Existentes</w:t>
       </w:r>
     </w:p>
     <w:p>
@@ -223,7 +409,10 @@
           <w:b/>
           <w:bCs/>
         </w:rPr>
-        <w:t xml:space="preserve">não informar ao usuário o tempo aproximado de espera até o seu atendimento durante o período em que o mesmo se encontra na fila.</w:t>
+        <w:t xml:space="preserve">não informar ao usuário o tempo aproximado de espera até o seu atendimento durante o período em que o mesmo se encontra na fila</w:t>
+      </w:r>
+      <w:r>
+        <w:t xml:space="preserve">.</w:t>
       </w:r>
     </w:p>
     <w:p>
@@ -241,14 +430,14 @@
         </w:pict>
       </w:r>
     </w:p>
-    <w:bookmarkEnd w:id="25"/>
-    <w:bookmarkStart w:id="28" w:name="referências"/>
+    <w:bookmarkEnd w:id="26"/>
+    <w:bookmarkStart w:id="29" w:name="referências"/>
     <w:p>
       <w:pPr>
         <w:pStyle w:val="Heading2"/>
       </w:pPr>
       <w:r>
-        <w:t xml:space="preserve">4. Referências</w:t>
+        <w:t xml:space="preserve">5. Referências</w:t>
       </w:r>
     </w:p>
     <w:p>
@@ -259,9 +448,9 @@
         <w:t xml:space="preserve">IDEC. Fila de banco demorada? Saiba seus direitos, 2017. Disponível em:</w:t>
       </w:r>
       <w:r>
-        <w:t xml:space="preserve"> </w:t>
-      </w:r>
-      <w:hyperlink r:id="rId26">
+        <w:br/>
+      </w:r>
+      <w:hyperlink r:id="rId27">
         <w:r>
           <w:rPr>
             <w:rStyle w:val="Hyperlink"/>
@@ -270,7 +459,13 @@
         </w:r>
       </w:hyperlink>
       <w:r>
-        <w:t xml:space="preserve">. Acesso em: 28 jun. 2026.</w:t>
+        <w:t xml:space="preserve">.</w:t>
+      </w:r>
+      <w:r>
+        <w:br/>
+      </w:r>
+      <w:r>
+        <w:t xml:space="preserve">Acesso em: 28 jun. 2026.</w:t>
       </w:r>
     </w:p>
     <w:p>
@@ -278,12 +473,18 @@
         <w:pStyle w:val="BodyText"/>
       </w:pPr>
       <w:r>
-        <w:t xml:space="preserve">WAITWHILE. Consumer Survey: The State of Waiting in Line. San Francisco: Waitwhile, 2024. Disponível em:</w:t>
+        <w:t xml:space="preserve">WAITWHILE. Consumer Survey: The State of Waiting in Line. San Francisco: Waitwhile, 2024.</w:t>
+      </w:r>
+      <w:r>
+        <w:br/>
+      </w:r>
+      <w:r>
+        <w:t xml:space="preserve">Disponível em:</w:t>
       </w:r>
       <w:r>
         <w:t xml:space="preserve"> </w:t>
       </w:r>
-      <w:hyperlink r:id="rId27">
+      <w:hyperlink r:id="rId28">
         <w:r>
           <w:rPr>
             <w:rStyle w:val="Hyperlink"/>
@@ -292,13 +493,18 @@
         </w:r>
       </w:hyperlink>
       <w:r>
-        <w:t xml:space="preserve">. Acesso em: 28 jun. 2026.</w:t>
-      </w:r>
-    </w:p>
-    <w:bookmarkEnd w:id="28"/>
+        <w:t xml:space="preserve">.</w:t>
+      </w:r>
+      <w:r>
+        <w:br/>
+      </w:r>
+      <w:r>
+        <w:t xml:space="preserve">Acesso em: 28 jun. 2026.</w:t>
+      </w:r>
+    </w:p>
     <w:bookmarkEnd w:id="29"/>
+    <w:bookmarkEnd w:id="30"/>
     <w:sectPr>
-      <w:headerReference w:type="default" r:id="rId9"/>
       <w:footerReference w:type="default" r:id="rId10"/>
       <w:footnotePr>
         <w:numRestart w:val="eachSect"/>
@@ -349,140 +555,6 @@
     </w:p>
   </w:footnote>
 </w:footnotes>
-</file>
-
-<file path=word/header1.xml><?xml version="1.0" encoding="utf-8"?>
-<w:hdr xmlns:m="http://schemas.openxmlformats.org/officeDocument/2006/math" xmlns:mc="http://schemas.openxmlformats.org/markup-compatibility/2006" xmlns:mo="http://schemas.microsoft.com/office/mac/office/2008/main" xmlns:mv="urn:schemas-microsoft-com:mac:vml" xmlns:o="urn:schemas-microsoft-com:office:office" xmlns:r="http://schemas.openxmlformats.org/officeDocument/2006/relationships" xmlns:v="urn:schemas-microsoft-com:vml" xmlns:w10="urn:schemas-microsoft-com:office:word" xmlns:w14="http://schemas.microsoft.com/office/word/2010/wordml" xmlns:w="http://schemas.openxmlformats.org/wordprocessingml/2006/main" xmlns:wne="http://schemas.microsoft.com/office/word/2006/wordml" xmlns:wp14="http://schemas.microsoft.com/office/word/2010/wordprocessingDrawing" xmlns:wp="http://schemas.openxmlformats.org/drawingml/2006/wordprocessingDrawing" xmlns:wpc="http://schemas.microsoft.com/office/word/2010/wordprocessingCanvas" xmlns:wpg="http://schemas.microsoft.com/office/word/2010/wordprocessingGroup" xmlns:wpi="http://schemas.microsoft.com/office/word/2010/wordprocessingInk" xmlns:wps="http://schemas.microsoft.com/office/word/2010/wordprocessingShape" mc:Ignorable="w14 wp14">
-  <w:p>
-    <w:pPr>
-      <w:pStyle w:val="Header"/>
-    </w:pPr>
-  </w:p>
-  <w:tbl>
-    <w:tblPr>
-      <w:tblW w:type="auto" w:w="0"/>
-      <w:tblLayout w:type="autofit"/>
-      <w:tblLook w:firstColumn="1" w:firstRow="1" w:lastColumn="0" w:lastRow="0" w:noHBand="0" w:noVBand="1" w:val="04A0"/>
-      <w:tblBorders>
-        <w:top w:val="none" w:sz="0" w:space="0" w:color="auto"/>
-        <w:left w:val="none" w:sz="0" w:space="0" w:color="auto"/>
-        <w:bottom w:val="none" w:sz="0" w:space="0" w:color="auto"/>
-        <w:right w:val="none" w:sz="0" w:space="0" w:color="auto"/>
-      </w:tblBorders>
-    </w:tblPr>
-    <w:tblGrid>
-      <w:gridCol w:w="4680"/>
-      <w:gridCol w:w="4680"/>
-    </w:tblGrid>
-    <w:tr>
-      <w:tc>
-        <w:tcPr>
-          <w:tcW w:type="dxa" w:w="2016"/>
-        </w:tcPr>
-        <w:p>
-          <w:pPr>
-            <w:jc w:val="left"/>
-          </w:pPr>
-          <w:r>
-            <w:drawing>
-              <wp:inline xmlns:a="http://schemas.openxmlformats.org/drawingml/2006/main" xmlns:pic="http://schemas.openxmlformats.org/drawingml/2006/picture">
-                <wp:extent cx="1143000" cy="450211"/>
-                <wp:docPr id="1" name="Picture 1"/>
-                <wp:cNvGraphicFramePr>
-                  <a:graphicFrameLocks noChangeAspect="1"/>
-                </wp:cNvGraphicFramePr>
-                <a:graphic>
-                  <a:graphicData uri="http://schemas.openxmlformats.org/drawingml/2006/picture">
-                    <pic:pic>
-                      <pic:nvPicPr>
-                        <pic:cNvPr id="0" name="logo-ufrb-20-anos.png"/>
-                        <pic:cNvPicPr/>
-                      </pic:nvPicPr>
-                      <pic:blipFill>
-                        <a:blip r:embed="rId1"/>
-                        <a:stretch>
-                          <a:fillRect/>
-                        </a:stretch>
-                      </pic:blipFill>
-                      <pic:spPr>
-                        <a:xfrm>
-                          <a:off x="0" y="0"/>
-                          <a:ext cx="1143000" cy="450211"/>
-                        </a:xfrm>
-                        <a:prstGeom prst="rect"/>
-                      </pic:spPr>
-                    </pic:pic>
-                  </a:graphicData>
-                </a:graphic>
-              </wp:inline>
-            </w:drawing>
-          </w:r>
-        </w:p>
-      </w:tc>
-      <w:tc>
-        <w:tcPr>
-          <w:tcW w:type="dxa" w:w="7200"/>
-        </w:tcPr>
-        <w:p>
-          <w:pPr>
-            <w:jc w:val="left"/>
-          </w:pPr>
-          <w:r>
-            <w:rPr>
-              <w:rFonts w:ascii="Times New Roman" w:hAnsi="Times New Roman"/>
-              <w:b/>
-              <w:color w:val="003D6B"/>
-              <w:sz w:val="16"/>
-            </w:rPr>
-            <w:t>UNIVERSIDADE FEDERAL DO RECÔNCAVO DA BAHIA — UFRB</w:t>
-          </w:r>
-        </w:p>
-        <w:p>
-          <w:pPr>
-            <w:jc w:val="left"/>
-          </w:pPr>
-          <w:r>
-            <w:rPr>
-              <w:rFonts w:ascii="Times New Roman" w:hAnsi="Times New Roman"/>
-              <w:b/>
-              <w:color w:val="006DAA"/>
-              <w:sz w:val="15"/>
-            </w:rPr>
-            <w:t>CENTRO DE CIÊNCIA E TECNOLOGIA — CETENS</w:t>
-          </w:r>
-        </w:p>
-        <w:p>
-          <w:pPr>
-            <w:jc w:val="left"/>
-          </w:pPr>
-          <w:r>
-            <w:rPr>
-              <w:rFonts w:ascii="Times New Roman" w:hAnsi="Times New Roman"/>
-              <w:b w:val="0"/>
-              <w:color w:val="505050"/>
-              <w:sz w:val="14"/>
-            </w:rPr>
-            <w:t>BACHARELADO EM SISTEMAS DE INFORMAÇÃO (EAD)</w:t>
-          </w:r>
-        </w:p>
-        <w:p>
-          <w:pPr>
-            <w:jc w:val="left"/>
-          </w:pPr>
-          <w:r>
-            <w:rPr>
-              <w:rFonts w:ascii="Times New Roman" w:hAnsi="Times New Roman"/>
-              <w:b w:val="0"/>
-              <w:color w:val="C89B3C"/>
-              <w:sz w:val="8"/>
-            </w:rPr>
-            <w:t>────────────────────────────────────────────────────────────────────────────────</w:t>
-          </w:r>
-        </w:p>
-      </w:tc>
-    </w:tr>
-  </w:tbl>
-</w:hdr>
 </file>
 
 <file path=word/numbering.xml><?xml version="1.0" encoding="utf-8"?>

</xml_diff>